<commit_message>
v0.8.0 Beta — DX12 GPU stress engine (Core/VRAM/Combined)
</commit_message>
<xml_diff>
--- a/HardwareToad_Guide.docx
+++ b/HardwareToad_Guide.docx
@@ -906,6 +906,60 @@
     </w:p>
     <w:p>
       <w:pPr>
+        <w:numPr>
+          <w:ilvl w:val="0"/>
+          <w:numId w:val="2"/>
+        </w:numPr>
+        <w:spacing w:after="60" w:before="60"/>
+      </w:pPr>
+      <w:r>
+        <w:rPr>
+          <w:rFonts w:ascii="Segoe UI" w:cs="Segoe UI" w:eastAsia="Segoe UI" w:hAnsi="Segoe UI"/>
+          <w:color w:val="1A1A1A"/>
+          <w:sz w:val="22"/>
+          <w:szCs w:val="22"/>
+        </w:rPr>
+        <w:t xml:space="preserve">GPU Core Test — dispatches 16M FMA compute threads via DX12 compute shader, maxes shader cores</w:t>
+      </w:r>
+    </w:p>
+    <w:p>
+      <w:pPr>
+        <w:numPr>
+          <w:ilvl w:val="0"/>
+          <w:numId w:val="2"/>
+        </w:numPr>
+        <w:spacing w:after="60" w:before="60"/>
+      </w:pPr>
+      <w:r>
+        <w:rPr>
+          <w:rFonts w:ascii="Segoe UI" w:cs="Segoe UI" w:eastAsia="Segoe UI" w:hAnsi="Segoe UI"/>
+          <w:color w:val="1A1A1A"/>
+          <w:sz w:val="22"/>
+          <w:szCs w:val="22"/>
+        </w:rPr>
+        <w:t xml:space="preserve">VRAM Test — continuous 256MB GPU memory transfers to saturate memory bandwidth</w:t>
+      </w:r>
+    </w:p>
+    <w:p>
+      <w:pPr>
+        <w:numPr>
+          <w:ilvl w:val="0"/>
+          <w:numId w:val="2"/>
+        </w:numPr>
+        <w:spacing w:after="60" w:before="60"/>
+      </w:pPr>
+      <w:r>
+        <w:rPr>
+          <w:rFonts w:ascii="Segoe UI" w:cs="Segoe UI" w:eastAsia="Segoe UI" w:hAnsi="Segoe UI"/>
+          <w:color w:val="1A1A1A"/>
+          <w:sz w:val="22"/>
+          <w:szCs w:val="22"/>
+        </w:rPr>
+        <w:t xml:space="preserve">GPU Combined — Compute + VRAM + Rasterizer simultaneously, maximum GPU thermal load</w:t>
+      </w:r>
+    </w:p>
+    <w:p>
+      <w:pPr>
         <w:spacing w:after="120" w:before="120"/>
       </w:pPr>
     </w:p>
@@ -1723,6 +1777,68 @@
                 <w:szCs w:val="21"/>
               </w:rPr>
               <w:t xml:space="preserve">PyInstaller packaging config</w:t>
+            </w:r>
+          </w:p>
+        </w:tc>
+      </w:tr>
+      <w:tr>
+        <w:tc>
+          <w:tcPr>
+            <w:tcW w:type="dxa" w:w="3200"/>
+            <w:tcBorders>
+              <w:top w:val="single" w:color="DDDDDD" w:sz="1"/>
+              <w:left w:val="single" w:color="DDDDDD" w:sz="1"/>
+              <w:bottom w:val="single" w:color="DDDDDD" w:sz="1"/>
+              <w:right w:val="single" w:color="DDDDDD" w:sz="1"/>
+            </w:tcBorders>
+            <w:shd w:fill="FFFFFF" w:val="clear"/>
+            <w:tcMar>
+              <w:top w:type="dxa" w:w="80"/>
+              <w:left w:type="dxa" w:w="120"/>
+              <w:bottom w:type="dxa" w:w="80"/>
+              <w:right w:type="dxa" w:w="120"/>
+            </w:tcMar>
+          </w:tcPr>
+          <w:p>
+            <w:r>
+              <w:rPr>
+                <w:rFonts w:ascii="Segoe UI" w:cs="Segoe UI" w:eastAsia="Segoe UI" w:hAnsi="Segoe UI"/>
+                <w:b/>
+                <w:bCs/>
+                <w:color w:val="1A1A1A"/>
+                <w:sz w:val="21"/>
+                <w:szCs w:val="21"/>
+              </w:rPr>
+              <w:t xml:space="preserve">GPUStress/</w:t>
+            </w:r>
+          </w:p>
+        </w:tc>
+        <w:tc>
+          <w:tcPr>
+            <w:tcW w:type="dxa" w:w="6160"/>
+            <w:tcBorders>
+              <w:top w:val="single" w:color="DDDDDD" w:sz="1"/>
+              <w:left w:val="single" w:color="DDDDDD" w:sz="1"/>
+              <w:bottom w:val="single" w:color="DDDDDD" w:sz="1"/>
+              <w:right w:val="single" w:color="DDDDDD" w:sz="1"/>
+            </w:tcBorders>
+            <w:shd w:fill="FFFFFF" w:val="clear"/>
+            <w:tcMar>
+              <w:top w:type="dxa" w:w="80"/>
+              <w:left w:type="dxa" w:w="120"/>
+              <w:bottom w:type="dxa" w:w="80"/>
+              <w:right w:type="dxa" w:w="120"/>
+            </w:tcMar>
+          </w:tcPr>
+          <w:p>
+            <w:r>
+              <w:rPr>
+                <w:rFonts w:ascii="Segoe UI" w:cs="Segoe UI" w:eastAsia="Segoe UI" w:hAnsi="Segoe UI"/>
+                <w:color w:val="555555"/>
+                <w:sz w:val="21"/>
+                <w:szCs w:val="21"/>
+              </w:rPr>
+              <w:t xml:space="preserve">DX12 GPU stress engine — C++ source + pre-built GPUStress.exe + HLSL shaders</w:t>
             </w:r>
           </w:p>
         </w:tc>

</xml_diff>